<commit_message>
Add a verified Sources and go deeper block to every export
Each room keeps sources.json and the room page renders it. Sheets, section exports, chapters, cards, and the study deck end with the same block in HTML, PDF, DOCX, PPTX, and Markdown. Links were opened in October 2026; a page that did not resolve is marked confirm and no URL was invented.

Co-authored-by: CYPHER0X9 <cipher0x9@users.noreply.github.com>
</commit_message>
<xml_diff>
--- a/downloads/templates/campaign-checklist.docx
+++ b/downloads/templates/campaign-checklist.docx
@@ -27,6 +27,36 @@
         <w:t>Independent, free, learning-only student project. Trademarks belong to their owners. Not affiliated or endorsed. Contact https://cyphermonkeylabs.com/#contact. Nothing is sold.</w:t>
       </w:r>
     </w:p>
+    <w:p>
+      <w:r>
+        <w:t>Sources and go deeper</w:t>
+      </w:r>
+    </w:p>
+    <w:p>
+      <w:r>
+        <w:t>Planning your implementation. vendor. https://documentation.five9.com/bundle/basic-admin/page/basic-admin/intro/planning-your-implementation.htm. last checked 2026-10.</w:t>
+      </w:r>
+    </w:p>
+    <w:p>
+      <w:r>
+        <w:t>Technical requirements PDF. vendor. https://documentation-be.five9.com/bundle/five9-technical-requirements/raw/resource/enus/five9-technical-requirements.pdf. last checked 2026-10.</w:t>
+      </w:r>
+    </w:p>
+    <w:p>
+      <w:r>
+        <w:t>IANA service names and port numbers. ports. https://www.iana.org/assignments/service-names-port-numbers/service-names-port-numbers.xhtml. last checked 2026-10.</w:t>
+      </w:r>
+    </w:p>
+    <w:p>
+      <w:r>
+        <w:t>RFC 3261, SIP: Session Initiation Protocol. rfc. https://www.rfc-editor.org/rfc/rfc3261. last checked 2026-10.</w:t>
+      </w:r>
+    </w:p>
+    <w:p>
+      <w:r>
+        <w:t>Interactive voice response. wikipedia. https://en.wikipedia.org/wiki/Interactive_voice_response. last checked 2026-10.</w:t>
+      </w:r>
+    </w:p>
   </w:body>
 </w:document>
 </file>
</xml_diff>